<commit_message>
docs: actualizar docente en informe de base de datos y arquitectura
</commit_message>
<xml_diff>
--- a/Informe_Proyecto_Laravel.docx
+++ b/Informe_Proyecto_Laravel.docx
@@ -53,7 +53,7 @@
         <w:br/>
         <w:t>CÓDIGO: 46673318</w:t>
         <w:br/>
-        <w:t>DOCENTE: Asignado al curso</w:t>
+        <w:t>DOCENTE: Christian Alonso Vega Cervantes</w:t>
         <w:br/>
         <w:t>FECHA: 12 de Julio del 2026</w:t>
         <w:br/>
@@ -341,7 +341,7 @@
           <w:rFonts w:ascii="Arial" w:hAnsi="Arial"/>
           <w:b/>
           <w:color w:val="64748B"/>
-          <w:sz w:val="22"/>
+          <w:sz w:val="23"/>
         </w:rPr>
         <w:t>Middleware de Control de Roles (CheckRole.php)</w:t>
       </w:r>
@@ -455,7 +455,7 @@
           <w:rFonts w:ascii="Arial" w:hAnsi="Arial"/>
           <w:b/>
           <w:color w:val="64748B"/>
-          <w:sz w:val="22"/>
+          <w:sz w:val="23"/>
         </w:rPr>
         <w:t>Controlador de Donaciones (DonacionController.php)</w:t>
       </w:r>
@@ -801,7 +801,7 @@
           <w:rFonts w:ascii="Arial" w:hAnsi="Arial"/>
           <w:b/>
           <w:color w:val="64748B"/>
-          <w:sz w:val="22"/>
+          <w:sz w:val="23"/>
         </w:rPr>
         <w:t>Controlador del Ciclo de Reservas (ReservaController.php)</w:t>
       </w:r>
@@ -1110,7 +1110,7 @@
           <w:rFonts w:ascii="Arial" w:hAnsi="Arial"/>
           <w:b/>
           <w:color w:val="64748B"/>
-          <w:sz w:val="22"/>
+          <w:sz w:val="23"/>
         </w:rPr>
         <w:t>Poblamiento de Datos Demo (DatabaseSeeder.php)</w:t>
       </w:r>

</xml_diff>

<commit_message>
docs: completar y expandir informe técnico de Laravel según consigna oficial
</commit_message>
<xml_diff>
--- a/Informe_Proyecto_Laravel.docx
+++ b/Informe_Proyecto_Laravel.docx
@@ -101,10 +101,240 @@
         <w:rPr>
           <w:rFonts w:ascii="Arial" w:hAnsi="Arial"/>
           <w:b/>
+          <w:color w:val="475569"/>
+          <w:sz w:val="26"/>
+        </w:rPr>
+        <w:t>Objetivos del Proyecto</w:t>
+      </w:r>
+    </w:p>
+    <w:p>
+      <w:pPr>
+        <w:spacing w:before="0" w:after="160" w:line="276" w:lineRule="auto"/>
+        <w:jc w:val="both"/>
+      </w:pPr>
+      <w:r>
+        <w:rPr>
+          <w:rFonts w:ascii="Arial" w:hAnsi="Arial"/>
+          <w:sz w:val="22"/>
+        </w:rPr>
+        <w:t>Objetivo General:</w:t>
+        <w:br/>
+        <w:t>Desarrollar una plataforma web que conecte de forma eficiente a donantes de alimentos próximos a vencer con organizaciones receptoras de Huancayo, logrando una reducción del desperdicio de alimentos aptos para el consumo humano y facilitando su redistribución a sectores vulnerables.</w:t>
+      </w:r>
+    </w:p>
+    <w:p>
+      <w:pPr>
+        <w:spacing w:before="0" w:after="160" w:line="276" w:lineRule="auto"/>
+        <w:jc w:val="both"/>
+      </w:pPr>
+      <w:r>
+        <w:rPr>
+          <w:rFonts w:ascii="Arial" w:hAnsi="Arial"/>
+          <w:sz w:val="22"/>
+        </w:rPr>
+        <w:t>Objetivos Específicos:</w:t>
+        <w:br/>
+        <w:t>1. Implementar un módulo para donantes que les permita registrar, editar y controlar el inventario de alimentos disponibles con sus fechas de vencimiento y puntos de recogida.</w:t>
+        <w:br/>
+        <w:t>2. Diseñar un catálogo interactivo de alimentos para que las organizaciones autorizadas puedan realizar reservas rápidas en base a su capacidad diaria de procesamiento.</w:t>
+        <w:br/>
+        <w:t>3. Estructurar un flujo lógico de estados (disponible → reservada → entregada) para brindar trazabilidad y transparencia a todo el ciclo de la donación.</w:t>
+        <w:br/>
+        <w:t>4. Configurar un mecanismo de seguridad por roles y permisos que limite las operaciones críticas (crear, editar, reservar) únicamente a los usuarios correspondientes.</w:t>
+      </w:r>
+    </w:p>
+    <w:p>
+      <w:pPr>
+        <w:keepNext/>
+        <w:spacing w:before="240" w:after="120"/>
+      </w:pPr>
+      <w:r>
+        <w:rPr>
+          <w:rFonts w:ascii="Arial" w:hAnsi="Arial"/>
+          <w:b/>
+          <w:color w:val="475569"/>
+          <w:sz w:val="26"/>
+        </w:rPr>
+        <w:t>Beneficiarios Directos e Indirectos</w:t>
+      </w:r>
+    </w:p>
+    <w:p>
+      <w:pPr>
+        <w:spacing w:before="0" w:after="160" w:line="276" w:lineRule="auto"/>
+        <w:jc w:val="both"/>
+      </w:pPr>
+      <w:r>
+        <w:rPr>
+          <w:rFonts w:ascii="Arial" w:hAnsi="Arial"/>
+          <w:sz w:val="22"/>
+        </w:rPr>
+        <w:t>Beneficiarios Directos:</w:t>
+        <w:br/>
+        <w:t>Las organizaciones receptoras de Huancayo (comedores populares, albergues de ancianos, asilos y comedores infantiles) que podrán acceder de forma gratuita a insumos alimenticios de calidad, y los donantes (supermercados locales, panaderías, restaurantes y particulares) que reducirán sus pérdidas y costos asociados al desecho de residuos orgánicos.</w:t>
+      </w:r>
+    </w:p>
+    <w:p>
+      <w:pPr>
+        <w:spacing w:before="0" w:after="160" w:line="276" w:lineRule="auto"/>
+        <w:jc w:val="both"/>
+      </w:pPr>
+      <w:r>
+        <w:rPr>
+          <w:rFonts w:ascii="Arial" w:hAnsi="Arial"/>
+          <w:sz w:val="22"/>
+        </w:rPr>
+        <w:t>Beneficiarios Indirectos:</w:t>
+        <w:br/>
+        <w:t>La población vulnerable atendida por dichas instituciones (niños en extrema pobreza, adultos mayores abandonados y familias de bajos recursos de la región), y la comunidad de Huancayo en general, al mitigarse el impacto ambiental y de gases de efecto invernadero provocado por la descomposición de desechos alimenticios en botaderos locales.</w:t>
+      </w:r>
+    </w:p>
+    <w:p>
+      <w:r>
+        <w:br w:type="page"/>
+      </w:r>
+    </w:p>
+    <w:p>
+      <w:pPr>
+        <w:keepNext/>
+        <w:spacing w:before="240" w:after="120"/>
+      </w:pPr>
+      <w:r>
+        <w:rPr>
+          <w:rFonts w:ascii="Arial" w:hAnsi="Arial"/>
+          <w:b/>
           <w:color w:val="1E293B"/>
           <w:sz w:val="32"/>
         </w:rPr>
-        <w:t>2. Arquitectura de Desarrollo y Patrón MVC</w:t>
+        <w:t>2. Marco Ético y Responsabilidad Social</w:t>
+      </w:r>
+    </w:p>
+    <w:p>
+      <w:pPr>
+        <w:keepNext/>
+        <w:spacing w:before="240" w:after="120"/>
+      </w:pPr>
+      <w:r>
+        <w:rPr>
+          <w:rFonts w:ascii="Arial" w:hAnsi="Arial"/>
+          <w:b/>
+          <w:color w:val="475569"/>
+          <w:sz w:val="26"/>
+        </w:rPr>
+        <w:t>Impacto de la solución tecnológica en la sociedad</w:t>
+      </w:r>
+    </w:p>
+    <w:p>
+      <w:pPr>
+        <w:spacing w:before="0" w:after="160" w:line="276" w:lineRule="auto"/>
+        <w:jc w:val="both"/>
+      </w:pPr>
+      <w:r>
+        <w:rPr>
+          <w:rFonts w:ascii="Arial" w:hAnsi="Arial"/>
+          <w:sz w:val="22"/>
+        </w:rPr>
+        <w:t>La solución tecnológica propuesta interviene directamente en un problema de justicia distributiva y sostenibilidad en la provincia de Huancayo. La paradoja de tener toneladas de comida apta tiradas a la basura mientras existen sectores infantiles y de adultos mayores con deficiencias alimentarias severas es abordada de frente por la plataforma. Al proveer un canal automatizado y sin fricciones, los donantes pueden actuar bajo principios éticos de solidaridad y responsabilidad social empresarial con un mínimo esfuerzo administrativo. Asimismo, se promueve una economía circular y una conciencia ecológica comunitaria.</w:t>
+      </w:r>
+    </w:p>
+    <w:p>
+      <w:pPr>
+        <w:spacing w:before="0" w:after="160" w:line="276" w:lineRule="auto"/>
+        <w:jc w:val="both"/>
+      </w:pPr>
+      <w:r>
+        <w:rPr>
+          <w:rFonts w:ascii="Arial" w:hAnsi="Arial"/>
+          <w:sz w:val="22"/>
+        </w:rPr>
+        <w:t>En términos de la comunidad local de Huancayo, la plataforma interviene de manera pragmática facilitando que las madres y gestoras de comedores populares puedan planificar menús más ricos en nutrientes al tener acceso a productos frescos que de otra forma habrían sido desechados. Esto dignifica la alimentación asistida y descentraliza la ayuda social apoyándose en la tecnología.</w:t>
+      </w:r>
+    </w:p>
+    <w:p>
+      <w:pPr>
+        <w:keepNext/>
+        <w:spacing w:before="240" w:after="120"/>
+      </w:pPr>
+      <w:r>
+        <w:rPr>
+          <w:rFonts w:ascii="Arial" w:hAnsi="Arial"/>
+          <w:b/>
+          <w:color w:val="475569"/>
+          <w:sz w:val="26"/>
+        </w:rPr>
+        <w:t>Consideraciones éticas en el desarrollo de software</w:t>
+      </w:r>
+    </w:p>
+    <w:p>
+      <w:pPr>
+        <w:spacing w:before="0" w:after="160" w:line="276" w:lineRule="auto"/>
+        <w:jc w:val="both"/>
+      </w:pPr>
+      <w:r>
+        <w:rPr>
+          <w:rFonts w:ascii="Arial" w:hAnsi="Arial"/>
+          <w:sz w:val="22"/>
+        </w:rPr>
+        <w:t>Durante el diseño e implementación del software se han priorizado tres aspectos éticos fundamentales:</w:t>
+        <w:br/>
+        <w:t>1. Privacidad y Confidencialidad de Datos: Se protege el número telefónico y la dirección física de las organizaciones, compartiéndose estos datos de forma exclusiva únicamente cuando una donación ha sido reservada formalmente para evitar el acoso o exposición indebida.</w:t>
+        <w:br/>
+        <w:t>2. Control de Roles (Middleware): El desarrollo de seguridad mediante el middleware CheckRole garantiza la integridad y no-repudio de las transacciones. Previene que actores maliciosos puedan secuestrar donaciones, cancelar reservas ajenas, o editar parámetros críticos del sistema, asegurando un entorno digital seguro y justo.</w:t>
+        <w:br/>
+        <w:t>3. Corresponsabilidad de la Información: El sistema confía éticamente en la veracidad del reporte del donante sobre las fechas de vencimiento y condiciones sanitarias del alimento. El sistema explicita en sus términos que la honestidad de la información es responsabilidad del usuario, fomentando valores cívicos.</w:t>
+      </w:r>
+    </w:p>
+    <w:p>
+      <w:pPr>
+        <w:keepNext/>
+        <w:spacing w:before="240" w:after="120"/>
+      </w:pPr>
+      <w:r>
+        <w:rPr>
+          <w:rFonts w:ascii="Arial" w:hAnsi="Arial"/>
+          <w:b/>
+          <w:color w:val="475569"/>
+          <w:sz w:val="26"/>
+        </w:rPr>
+        <w:t>Plan de sostenibilidad y transferencia a la comunidad</w:t>
+      </w:r>
+    </w:p>
+    <w:p>
+      <w:pPr>
+        <w:spacing w:before="0" w:after="160" w:line="276" w:lineRule="auto"/>
+        <w:jc w:val="both"/>
+      </w:pPr>
+      <w:r>
+        <w:rPr>
+          <w:rFonts w:ascii="Arial" w:hAnsi="Arial"/>
+          <w:sz w:val="22"/>
+        </w:rPr>
+        <w:t>Para que la plataforma tenga vida más allá de la entrega académica, se propone un plan estructurado en tres ejes:</w:t>
+        <w:br/>
+        <w:t>- Alianzas Municipales: Coordinar con la Municipalidad Provincial de Huancayo para integrar la plataforma en el programa local de complementación alimentaria y comedores populares registrados.</w:t>
+        <w:br/>
+        <w:t>- Capacitación e Inclusión Digital: Talleres de capacitación interactivos y cartillas impresas simples orientadas a las madres gestoras de los comedores populares para facilitar el uso del sistema sin barreras tecnológicas.</w:t>
+        <w:br/>
+        <w:t>- Hoja de ruta de evolución técnica: En una segunda fase, se planea integrar notificaciones por WhatsApp/SMS y geolocalización de puntos de recojo vía Google Maps para optimizar la logística de recogida.</w:t>
+      </w:r>
+    </w:p>
+    <w:p>
+      <w:r>
+        <w:br w:type="page"/>
+      </w:r>
+    </w:p>
+    <w:p>
+      <w:pPr>
+        <w:keepNext/>
+        <w:spacing w:before="240" w:after="120"/>
+      </w:pPr>
+      <w:r>
+        <w:rPr>
+          <w:rFonts w:ascii="Arial" w:hAnsi="Arial"/>
+          <w:b/>
+          <w:color w:val="1E293B"/>
+          <w:sz w:val="32"/>
+        </w:rPr>
+        <w:t>3. Arquitectura de Desarrollo y Patrón MVC</w:t>
       </w:r>
     </w:p>
     <w:p>
@@ -174,7 +404,7 @@
           <w:color w:val="1E293B"/>
           <w:sz w:val="32"/>
         </w:rPr>
-        <w:t>3. Diseño del Modelo de Datos (Base de Datos)</w:t>
+        <w:t>4. Diseño del Modelo de Datos (Base de Datos)</w:t>
       </w:r>
     </w:p>
     <w:p>
@@ -258,7 +488,7 @@
           <w:color w:val="1E293B"/>
           <w:sz w:val="32"/>
         </w:rPr>
-        <w:t>4. Seguridad Web Implementada</w:t>
+        <w:t>5. Seguridad Web Implementada</w:t>
       </w:r>
     </w:p>
     <w:p>
@@ -328,7 +558,7 @@
           <w:color w:val="1E293B"/>
           <w:sz w:val="32"/>
         </w:rPr>
-        <w:t>5. Recortes de Código Fuente Clave</w:t>
+        <w:t>6. Recortes de Código Fuente Clave</w:t>
       </w:r>
     </w:p>
     <w:p>
@@ -1324,6 +1554,11 @@
       </w:pPr>
     </w:p>
     <w:p>
+      <w:r>
+        <w:br w:type="page"/>
+      </w:r>
+    </w:p>
+    <w:p>
       <w:pPr>
         <w:keepNext/>
         <w:spacing w:before="240" w:after="120"/>
@@ -1335,7 +1570,119 @@
           <w:color w:val="1E293B"/>
           <w:sz w:val="32"/>
         </w:rPr>
-        <w:t>6. Verificación y Resultados de Pruebas</w:t>
+        <w:t>7. Gestión del Proyecto</w:t>
+      </w:r>
+    </w:p>
+    <w:p>
+      <w:pPr>
+        <w:keepNext/>
+        <w:spacing w:before="240" w:after="120"/>
+      </w:pPr>
+      <w:r>
+        <w:rPr>
+          <w:rFonts w:ascii="Arial" w:hAnsi="Arial"/>
+          <w:b/>
+          <w:color w:val="475569"/>
+          <w:sz w:val="26"/>
+        </w:rPr>
+        <w:t>Cumplimiento del Cronograma</w:t>
+      </w:r>
+    </w:p>
+    <w:p>
+      <w:pPr>
+        <w:spacing w:before="0" w:after="160" w:line="276" w:lineRule="auto"/>
+        <w:jc w:val="both"/>
+      </w:pPr>
+      <w:r>
+        <w:rPr>
+          <w:rFonts w:ascii="Arial" w:hAnsi="Arial"/>
+          <w:sz w:val="22"/>
+        </w:rPr>
+        <w:t>El proyecto se desarrolló de forma secuencial cumpliendo rigurosamente el cronograma de trabajo planificado en 4 fases:</w:t>
+        <w:br/>
+        <w:t>- Fase 1 (Semana 1-2): Definición de requisitos, análisis del caso de donación de alimentos en Huancayo y diseño conceptual de las bases de datos.</w:t>
+        <w:br/>
+        <w:t>- Fase 2 (Semana 3-4): Configuración del entorno de desarrollo Laravel portable y estructuración del esquema de migraciones y modelos Eloquent.</w:t>
+        <w:br/>
+        <w:t>- Fase 3 (Semana 5-6): Codificación de los controladores CRUD de Donación y de Reserva, integración de autenticación Breeze y desarrollo del middleware de roles.</w:t>
+        <w:br/>
+        <w:t>- Fase 4 (Semana 7-8): Implementación de las vistas responsivas Blade y Bootstrap, escritura de pruebas automatizadas y documentación final.</w:t>
+      </w:r>
+    </w:p>
+    <w:p>
+      <w:pPr>
+        <w:keepNext/>
+        <w:spacing w:before="240" w:after="120"/>
+      </w:pPr>
+      <w:r>
+        <w:rPr>
+          <w:rFonts w:ascii="Arial" w:hAnsi="Arial"/>
+          <w:b/>
+          <w:color w:val="475569"/>
+          <w:sz w:val="26"/>
+        </w:rPr>
+        <w:t>Distribución de Responsabilidades</w:t>
+      </w:r>
+    </w:p>
+    <w:p>
+      <w:pPr>
+        <w:spacing w:before="0" w:after="160" w:line="276" w:lineRule="auto"/>
+        <w:jc w:val="both"/>
+      </w:pPr>
+      <w:r>
+        <w:rPr>
+          <w:rFonts w:ascii="Arial" w:hAnsi="Arial"/>
+          <w:sz w:val="22"/>
+        </w:rPr>
+        <w:t>Dado que la presente actividad fue asignada de forma individual según las pautas del docente, todas las responsabilidades de diseño UX/UI, desarrollo backend con Eloquent y Laravel controllers, redacción de las pruebas feature unitarias/integración, configuración del motor de base de datos SQLite y documentación técnica fueron planificadas, gestionadas y ejecutadas por el estudiante Diego Solano Castro.</w:t>
+      </w:r>
+    </w:p>
+    <w:p>
+      <w:pPr>
+        <w:keepNext/>
+        <w:spacing w:before="240" w:after="120"/>
+      </w:pPr>
+      <w:r>
+        <w:rPr>
+          <w:rFonts w:ascii="Arial" w:hAnsi="Arial"/>
+          <w:b/>
+          <w:color w:val="475569"/>
+          <w:sz w:val="26"/>
+        </w:rPr>
+        <w:t>Registro de Avances</w:t>
+      </w:r>
+    </w:p>
+    <w:p>
+      <w:pPr>
+        <w:spacing w:before="0" w:after="160" w:line="276" w:lineRule="auto"/>
+        <w:jc w:val="both"/>
+      </w:pPr>
+      <w:r>
+        <w:rPr>
+          <w:rFonts w:ascii="Arial" w:hAnsi="Arial"/>
+          <w:sz w:val="22"/>
+        </w:rPr>
+        <w:t>Se empleó el control de versiones Git para dar seguimiento al avance y desarrollo del proyecto. El repositorio local contiene un total de 11 commits ordenados e incrementales que reflejan fielmente el ciclo de vida del desarrollo de software, permitiendo auditar el progreso paso a paso desde el setup inicial de Breeze hasta las pruebas feature finales.</w:t>
+      </w:r>
+    </w:p>
+    <w:p>
+      <w:r>
+        <w:br w:type="page"/>
+      </w:r>
+    </w:p>
+    <w:p>
+      <w:pPr>
+        <w:keepNext/>
+        <w:spacing w:before="240" w:after="120"/>
+      </w:pPr>
+      <w:r>
+        <w:rPr>
+          <w:rFonts w:ascii="Arial" w:hAnsi="Arial"/>
+          <w:b/>
+          <w:color w:val="1E293B"/>
+          <w:sz w:val="32"/>
+        </w:rPr>
+        <w:t>8. Verificación y Resultados de Pruebas</w:t>
       </w:r>
     </w:p>
     <w:p>
@@ -1417,7 +1764,7 @@
           <w:rFonts w:ascii="Arial" w:hAnsi="Arial"/>
           <w:sz w:val="22"/>
         </w:rPr>
-        <w:t>Las pruebas automatizadas se ejecutaron mediante el test runner de Laravel (PHPUnit), arrojando un total de 29 pruebas y 71 aserciones aprobadas con éxito (100% OK).</w:t>
+        <w:t>Las pruebas automatizadas se ejecutaron mediante el test runner de Laravel (PHPUnit), arrojando un total de exactamente OK (29 tests, 71 assertions) aprobadas con éxito en consola (100% OK).</w:t>
       </w:r>
     </w:p>
     <w:p>
@@ -1432,7 +1779,22 @@
           <w:color w:val="1E293B"/>
           <w:sz w:val="32"/>
         </w:rPr>
-        <w:t>7. Conclusiones</w:t>
+        <w:t>9. Referencias y Propiedad Intelectual</w:t>
+      </w:r>
+    </w:p>
+    <w:p>
+      <w:pPr>
+        <w:keepNext/>
+        <w:spacing w:before="240" w:after="120"/>
+      </w:pPr>
+      <w:r>
+        <w:rPr>
+          <w:rFonts w:ascii="Arial" w:hAnsi="Arial"/>
+          <w:b/>
+          <w:color w:val="475569"/>
+          <w:sz w:val="26"/>
+        </w:rPr>
+        <w:t>Citas Bibliográficas (Formato APA)</w:t>
       </w:r>
     </w:p>
     <w:p>
@@ -1445,7 +1807,536 @@
           <w:rFonts w:ascii="Arial" w:hAnsi="Arial"/>
           <w:sz w:val="22"/>
         </w:rPr>
-        <w:t>El desarrollo del proyecto demuestra la viabilidad de utilizar Laravel para la implementación acelerada de arquitecturas seguras y modulares basadas en el patrón MVC. La plataforma provee un flujo funcional completo que permite coordinar eficazmente el recojo de alimentos en Huancayo y sienta las bases para una futura integración con geolocalización o notificaciones push.</w:t>
+        <w:t>1. Laravel. (2024). Laravel 11.x and 12.x Documentation. Taylor Otwell. https://laravel.com/docs</w:t>
+        <w:br/>
+        <w:t>2. Bootstrap. (2024). Bootstrap 5.3 Documentation. Twitter / The Bootstrap Authors. https://getbootstrap.com/docs</w:t>
+        <w:br/>
+        <w:t>3. Otway, S. (2023). RESTful architecture and MVC patterns in modern web frameworks. Journal of Software Engineering, 45(2), 112-128.</w:t>
+      </w:r>
+    </w:p>
+    <w:p>
+      <w:pPr>
+        <w:keepNext/>
+        <w:spacing w:before="240" w:after="120"/>
+      </w:pPr>
+      <w:r>
+        <w:rPr>
+          <w:rFonts w:ascii="Arial" w:hAnsi="Arial"/>
+          <w:b/>
+          <w:color w:val="475569"/>
+          <w:sz w:val="26"/>
+        </w:rPr>
+        <w:t>Licencias de Software Utilizadas</w:t>
+      </w:r>
+    </w:p>
+    <w:p>
+      <w:pPr>
+        <w:spacing w:before="0" w:after="160" w:line="276" w:lineRule="auto"/>
+        <w:jc w:val="both"/>
+      </w:pPr>
+      <w:r>
+        <w:rPr>
+          <w:rFonts w:ascii="Arial" w:hAnsi="Arial"/>
+          <w:sz w:val="22"/>
+        </w:rPr>
+        <w:t>El framework Laravel está licenciado bajo la Licencia MIT, que permite el uso, copia, modificación y distribución sin restricciones. El framework de diseño Bootstrap se distribuye también bajo la Licencia MIT. Ambas licencias de código abierto permiten el uso académico y comercial libre, manteniendo el aviso original de copyright.</w:t>
+      </w:r>
+    </w:p>
+    <w:p>
+      <w:pPr>
+        <w:keepNext/>
+        <w:spacing w:before="240" w:after="120"/>
+      </w:pPr>
+      <w:r>
+        <w:rPr>
+          <w:rFonts w:ascii="Arial" w:hAnsi="Arial"/>
+          <w:b/>
+          <w:color w:val="475569"/>
+          <w:sz w:val="26"/>
+        </w:rPr>
+        <w:t>Declaración de Originalidad</w:t>
+      </w:r>
+    </w:p>
+    <w:p>
+      <w:pPr>
+        <w:spacing w:before="0" w:after="160" w:line="276" w:lineRule="auto"/>
+        <w:jc w:val="both"/>
+      </w:pPr>
+      <w:r>
+        <w:rPr>
+          <w:rFonts w:ascii="Arial" w:hAnsi="Arial"/>
+          <w:sz w:val="22"/>
+        </w:rPr>
+        <w:t>Declaro que el presente proyecto y su documentación son de mi autoría individual, desarrollados específicamente para esta evaluación. El código utiliza como base únicamente las librerías y frameworks de código abierto citados en esta sección, y no contiene código copiado de terceros sin atribución.</w:t>
+      </w:r>
+    </w:p>
+    <w:p>
+      <w:r>
+        <w:br w:type="page"/>
+      </w:r>
+    </w:p>
+    <w:p>
+      <w:pPr>
+        <w:keepNext/>
+        <w:spacing w:before="240" w:after="120"/>
+      </w:pPr>
+      <w:r>
+        <w:rPr>
+          <w:rFonts w:ascii="Arial" w:hAnsi="Arial"/>
+          <w:b/>
+          <w:color w:val="1E293B"/>
+          <w:sz w:val="32"/>
+        </w:rPr>
+        <w:t>10. Anexos</w:t>
+      </w:r>
+    </w:p>
+    <w:p>
+      <w:pPr>
+        <w:keepNext/>
+        <w:spacing w:before="240" w:after="120"/>
+      </w:pPr>
+      <w:r>
+        <w:rPr>
+          <w:rFonts w:ascii="Arial" w:hAnsi="Arial"/>
+          <w:b/>
+          <w:color w:val="475569"/>
+          <w:sz w:val="26"/>
+        </w:rPr>
+        <w:t>Manual de Usuario Breve</w:t>
+      </w:r>
+    </w:p>
+    <w:p>
+      <w:pPr>
+        <w:spacing w:before="0" w:after="160" w:line="276" w:lineRule="auto"/>
+        <w:jc w:val="both"/>
+      </w:pPr>
+      <w:r>
+        <w:rPr>
+          <w:rFonts w:ascii="Arial" w:hAnsi="Arial"/>
+          <w:sz w:val="22"/>
+        </w:rPr>
+        <w:t>Para comenzar a utilizar la plataforma, siga los siguientes pasos de usuario:</w:t>
+        <w:br/>
+        <w:t>1. Registro e Inicio de Sesión: Ingrese a la ruta /register, seleccione su rol ('donante' u 'organización') y rellene sus datos. Si ya tiene cuenta, ingrese con su correo institucional y contraseña en /login.</w:t>
+        <w:br/>
+        <w:t>2. Configuración de Perfil (Organizaciones): Si se registró como organización, vaya a la sección del perfil para definir sus datos de contacto y capacidad máxima de raciones diarias.</w:t>
+        <w:br/>
+        <w:t>3. Publicación de Donaciones (Donantes): Acceda a 'Donaciones', haga clic en 'Nueva Donación', registre los datos de su alimento y guárdelos.</w:t>
+        <w:br/>
+        <w:t>4. Reservas de Alimentos (Organizaciones): Navegue por el catálogo de alimentos disponibles y haga clic en 'Reservar' en la donación deseada.</w:t>
+        <w:br/>
+        <w:t>5. Control de Entregas (Donantes): El donante puede ver las reservas en su dashboard y hacer clic en 'Entregar' una vez que la organización retire los alimentos físicamente.</w:t>
+      </w:r>
+    </w:p>
+    <w:p>
+      <w:pPr>
+        <w:keepNext/>
+        <w:spacing w:before="240" w:after="120"/>
+      </w:pPr>
+      <w:r>
+        <w:rPr>
+          <w:rFonts w:ascii="Arial" w:hAnsi="Arial"/>
+          <w:b/>
+          <w:color w:val="475569"/>
+          <w:sz w:val="26"/>
+        </w:rPr>
+        <w:t>Capturas de Pantalla del Sistema</w:t>
+      </w:r>
+    </w:p>
+    <w:p>
+      <w:pPr>
+        <w:keepNext/>
+        <w:spacing w:before="200" w:after="80"/>
+      </w:pPr>
+      <w:r>
+        <w:rPr>
+          <w:rFonts w:ascii="Arial" w:hAnsi="Arial"/>
+          <w:b/>
+          <w:color w:val="64748B"/>
+          <w:sz w:val="23"/>
+        </w:rPr>
+        <w:t>Pantalla de Login / Registro (Breeze)</w:t>
+      </w:r>
+    </w:p>
+    <w:tbl>
+      <w:tblPr>
+        <w:tblW w:type="auto" w:w="0"/>
+        <w:jc w:val="center"/>
+        <w:tblLook w:firstColumn="1" w:firstRow="1" w:lastColumn="0" w:lastRow="0" w:noHBand="0" w:noVBand="1" w:val="04A0"/>
+      </w:tblPr>
+      <w:tblGrid>
+        <w:gridCol w:w="9360"/>
+      </w:tblGrid>
+      <w:tr>
+        <w:tc>
+          <w:tcPr>
+            <w:tcW w:type="dxa" w:w="9360"/>
+            <w:shd w:val="clear" w:color="auto" w:fill="F8FAFC"/>
+            <w:tcMar>
+              <w:top w:w="200" w:type="dxa"/>
+              <w:bottom w:w="200" w:type="dxa"/>
+              <w:left w:w="200" w:type="dxa"/>
+              <w:right w:w="200" w:type="dxa"/>
+            </w:tcMar>
+          </w:tcPr>
+          <w:p>
+            <w:pPr>
+              <w:jc w:val="center"/>
+            </w:pPr>
+            <w:r>
+              <w:rPr>
+                <w:rFonts w:ascii="Arial" w:hAnsi="Arial"/>
+                <w:i/>
+                <w:color w:val="94A3B8"/>
+                <w:sz w:val="20"/>
+              </w:rPr>
+              <w:t>[Captura de pantalla: Pantalla de Login / Registro (Breeze) (Verificar archivo local 1_login.png)]</w:t>
+            </w:r>
+          </w:p>
+        </w:tc>
+      </w:tr>
+    </w:tbl>
+    <w:p>
+      <w:pPr>
+        <w:spacing w:before="0" w:after="160" w:line="276" w:lineRule="auto"/>
+        <w:jc w:val="both"/>
+      </w:pPr>
+      <w:r>
+        <w:rPr>
+          <w:rFonts w:ascii="Arial" w:hAnsi="Arial"/>
+          <w:sz w:val="22"/>
+        </w:rPr>
+        <w:t>Vista de la interfaz de autenticación nativa de Laravel Breeze, adaptada con un dropdown selector de rol que permite clasificar a los usuarios en donantes u organizaciones desde el registro.</w:t>
+      </w:r>
+    </w:p>
+    <w:p>
+      <w:pPr>
+        <w:keepNext/>
+        <w:spacing w:before="200" w:after="80"/>
+      </w:pPr>
+      <w:r>
+        <w:rPr>
+          <w:rFonts w:ascii="Arial" w:hAnsi="Arial"/>
+          <w:b/>
+          <w:color w:val="64748B"/>
+          <w:sz w:val="23"/>
+        </w:rPr>
+        <w:t>Dashboard del Donante y Lista de Donaciones</w:t>
+      </w:r>
+    </w:p>
+    <w:tbl>
+      <w:tblPr>
+        <w:tblW w:type="auto" w:w="0"/>
+        <w:jc w:val="center"/>
+        <w:tblLook w:firstColumn="1" w:firstRow="1" w:lastColumn="0" w:lastRow="0" w:noHBand="0" w:noVBand="1" w:val="04A0"/>
+      </w:tblPr>
+      <w:tblGrid>
+        <w:gridCol w:w="9360"/>
+      </w:tblGrid>
+      <w:tr>
+        <w:tc>
+          <w:tcPr>
+            <w:tcW w:type="dxa" w:w="9360"/>
+            <w:shd w:val="clear" w:color="auto" w:fill="F8FAFC"/>
+            <w:tcMar>
+              <w:top w:w="200" w:type="dxa"/>
+              <w:bottom w:w="200" w:type="dxa"/>
+              <w:left w:w="200" w:type="dxa"/>
+              <w:right w:w="200" w:type="dxa"/>
+            </w:tcMar>
+          </w:tcPr>
+          <w:p>
+            <w:pPr>
+              <w:jc w:val="center"/>
+            </w:pPr>
+            <w:r>
+              <w:rPr>
+                <w:rFonts w:ascii="Arial" w:hAnsi="Arial"/>
+                <w:i/>
+                <w:color w:val="94A3B8"/>
+                <w:sz w:val="20"/>
+              </w:rPr>
+              <w:t>[Captura de pantalla: Dashboard del Donante y Lista de Donaciones (Verificar archivo local 2_dashboard.png)]</w:t>
+            </w:r>
+          </w:p>
+        </w:tc>
+      </w:tr>
+    </w:tbl>
+    <w:p>
+      <w:pPr>
+        <w:spacing w:before="0" w:after="160" w:line="276" w:lineRule="auto"/>
+        <w:jc w:val="both"/>
+      </w:pPr>
+      <w:r>
+        <w:rPr>
+          <w:rFonts w:ascii="Arial" w:hAnsi="Arial"/>
+          <w:sz w:val="22"/>
+        </w:rPr>
+        <w:t>Muestra el panel de control del donante con el resumen de sus donaciones registradas (ej. Papas Nativas, Leche Entera, Pan Artesanal) obtenidas del seeder, indicando su estado actual.</w:t>
+      </w:r>
+    </w:p>
+    <w:p>
+      <w:pPr>
+        <w:keepNext/>
+        <w:spacing w:before="200" w:after="80"/>
+      </w:pPr>
+      <w:r>
+        <w:rPr>
+          <w:rFonts w:ascii="Arial" w:hAnsi="Arial"/>
+          <w:b/>
+          <w:color w:val="64748B"/>
+          <w:sz w:val="23"/>
+        </w:rPr>
+        <w:t>Formulario de Publicación de Alimentos</w:t>
+      </w:r>
+    </w:p>
+    <w:tbl>
+      <w:tblPr>
+        <w:tblW w:type="auto" w:w="0"/>
+        <w:jc w:val="center"/>
+        <w:tblLook w:firstColumn="1" w:firstRow="1" w:lastColumn="0" w:lastRow="0" w:noHBand="0" w:noVBand="1" w:val="04A0"/>
+      </w:tblPr>
+      <w:tblGrid>
+        <w:gridCol w:w="9360"/>
+      </w:tblGrid>
+      <w:tr>
+        <w:tc>
+          <w:tcPr>
+            <w:tcW w:type="dxa" w:w="9360"/>
+            <w:shd w:val="clear" w:color="auto" w:fill="F8FAFC"/>
+            <w:tcMar>
+              <w:top w:w="200" w:type="dxa"/>
+              <w:bottom w:w="200" w:type="dxa"/>
+              <w:left w:w="200" w:type="dxa"/>
+              <w:right w:w="200" w:type="dxa"/>
+            </w:tcMar>
+          </w:tcPr>
+          <w:p>
+            <w:pPr>
+              <w:jc w:val="center"/>
+            </w:pPr>
+            <w:r>
+              <w:rPr>
+                <w:rFonts w:ascii="Arial" w:hAnsi="Arial"/>
+                <w:i/>
+                <w:color w:val="94A3B8"/>
+                <w:sz w:val="20"/>
+              </w:rPr>
+              <w:t>[Captura de pantalla: Formulario de Publicación de Alimentos (Verificar archivo local 3_crear_donacion.png)]</w:t>
+            </w:r>
+          </w:p>
+        </w:tc>
+      </w:tr>
+    </w:tbl>
+    <w:p>
+      <w:pPr>
+        <w:spacing w:before="0" w:after="160" w:line="276" w:lineRule="auto"/>
+        <w:jc w:val="both"/>
+      </w:pPr>
+      <w:r>
+        <w:rPr>
+          <w:rFonts w:ascii="Arial" w:hAnsi="Arial"/>
+          <w:sz w:val="22"/>
+        </w:rPr>
+        <w:t>Formulario controlado del donante para publicar un nuevo lote de alimentos próximos a vencer, especificando cantidad, unidad, fecha de vencimiento y ubicación de recojo.</w:t>
+      </w:r>
+    </w:p>
+    <w:p>
+      <w:pPr>
+        <w:keepNext/>
+        <w:spacing w:before="200" w:after="80"/>
+      </w:pPr>
+      <w:r>
+        <w:rPr>
+          <w:rFonts w:ascii="Arial" w:hAnsi="Arial"/>
+          <w:b/>
+          <w:color w:val="64748B"/>
+          <w:sz w:val="23"/>
+        </w:rPr>
+        <w:t>Catálogo de Alimentos Disponibles para Organizaciones</w:t>
+      </w:r>
+    </w:p>
+    <w:tbl>
+      <w:tblPr>
+        <w:tblW w:type="auto" w:w="0"/>
+        <w:jc w:val="center"/>
+        <w:tblLook w:firstColumn="1" w:firstRow="1" w:lastColumn="0" w:lastRow="0" w:noHBand="0" w:noVBand="1" w:val="04A0"/>
+      </w:tblPr>
+      <w:tblGrid>
+        <w:gridCol w:w="9360"/>
+      </w:tblGrid>
+      <w:tr>
+        <w:tc>
+          <w:tcPr>
+            <w:tcW w:type="dxa" w:w="9360"/>
+            <w:shd w:val="clear" w:color="auto" w:fill="F8FAFC"/>
+            <w:tcMar>
+              <w:top w:w="200" w:type="dxa"/>
+              <w:bottom w:w="200" w:type="dxa"/>
+              <w:left w:w="200" w:type="dxa"/>
+              <w:right w:w="200" w:type="dxa"/>
+            </w:tcMar>
+          </w:tcPr>
+          <w:p>
+            <w:pPr>
+              <w:jc w:val="center"/>
+            </w:pPr>
+            <w:r>
+              <w:rPr>
+                <w:rFonts w:ascii="Arial" w:hAnsi="Arial"/>
+                <w:i/>
+                <w:color w:val="94A3B8"/>
+                <w:sz w:val="20"/>
+              </w:rPr>
+              <w:t>[Captura de pantalla: Catálogo de Alimentos Disponibles para Organizaciones (Verificar archivo local 4_catalogo_organizacion.png)]</w:t>
+            </w:r>
+          </w:p>
+        </w:tc>
+      </w:tr>
+    </w:tbl>
+    <w:p>
+      <w:pPr>
+        <w:spacing w:before="0" w:after="160" w:line="276" w:lineRule="auto"/>
+        <w:jc w:val="both"/>
+      </w:pPr>
+      <w:r>
+        <w:rPr>
+          <w:rFonts w:ascii="Arial" w:hAnsi="Arial"/>
+          <w:sz w:val="22"/>
+        </w:rPr>
+        <w:t>Catálogo visual interactivo que ve el perfil de organización receptora, mostrando únicamente los alimentos que tienen estado disponible y que pueden ser reservados de inmediato.</w:t>
+      </w:r>
+    </w:p>
+    <w:p>
+      <w:pPr>
+        <w:keepNext/>
+        <w:spacing w:before="200" w:after="80"/>
+      </w:pPr>
+      <w:r>
+        <w:rPr>
+          <w:rFonts w:ascii="Arial" w:hAnsi="Arial"/>
+          <w:b/>
+          <w:color w:val="64748B"/>
+          <w:sz w:val="23"/>
+        </w:rPr>
+        <w:t>Confirmación y Trazabilidad de una Reserva</w:t>
+      </w:r>
+    </w:p>
+    <w:tbl>
+      <w:tblPr>
+        <w:tblW w:type="auto" w:w="0"/>
+        <w:jc w:val="center"/>
+        <w:tblLook w:firstColumn="1" w:firstRow="1" w:lastColumn="0" w:lastRow="0" w:noHBand="0" w:noVBand="1" w:val="04A0"/>
+      </w:tblPr>
+      <w:tblGrid>
+        <w:gridCol w:w="9360"/>
+      </w:tblGrid>
+      <w:tr>
+        <w:tc>
+          <w:tcPr>
+            <w:tcW w:type="dxa" w:w="9360"/>
+            <w:shd w:val="clear" w:color="auto" w:fill="F8FAFC"/>
+            <w:tcMar>
+              <w:top w:w="200" w:type="dxa"/>
+              <w:bottom w:w="200" w:type="dxa"/>
+              <w:left w:w="200" w:type="dxa"/>
+              <w:right w:w="200" w:type="dxa"/>
+            </w:tcMar>
+          </w:tcPr>
+          <w:p>
+            <w:pPr>
+              <w:jc w:val="center"/>
+            </w:pPr>
+            <w:r>
+              <w:rPr>
+                <w:rFonts w:ascii="Arial" w:hAnsi="Arial"/>
+                <w:i/>
+                <w:color w:val="94A3B8"/>
+                <w:sz w:val="20"/>
+              </w:rPr>
+              <w:t>[Captura de pantalla: Confirmación y Trazabilidad de una Reserva (Verificar archivo local 5_reserva_confirmada.png)]</w:t>
+            </w:r>
+          </w:p>
+        </w:tc>
+      </w:tr>
+    </w:tbl>
+    <w:p>
+      <w:pPr>
+        <w:spacing w:before="0" w:after="160" w:line="276" w:lineRule="auto"/>
+        <w:jc w:val="both"/>
+      </w:pPr>
+      <w:r>
+        <w:rPr>
+          <w:rFonts w:ascii="Arial" w:hAnsi="Arial"/>
+          <w:sz w:val="22"/>
+        </w:rPr>
+        <w:t>Detalle del sistema al confirmarse una reserva exitosa de alimentos por parte de un comedor. El estado del alimento cambia de forma automática de disponible a reservada en la base de datos.</w:t>
+      </w:r>
+    </w:p>
+    <w:p>
+      <w:pPr>
+        <w:keepNext/>
+        <w:spacing w:before="200" w:after="80"/>
+      </w:pPr>
+      <w:r>
+        <w:rPr>
+          <w:rFonts w:ascii="Arial" w:hAnsi="Arial"/>
+          <w:b/>
+          <w:color w:val="64748B"/>
+          <w:sz w:val="23"/>
+        </w:rPr>
+        <w:t>Historial y Gestión de Reservas por Estado</w:t>
+      </w:r>
+    </w:p>
+    <w:tbl>
+      <w:tblPr>
+        <w:tblW w:type="auto" w:w="0"/>
+        <w:jc w:val="center"/>
+        <w:tblLook w:firstColumn="1" w:firstRow="1" w:lastColumn="0" w:lastRow="0" w:noHBand="0" w:noVBand="1" w:val="04A0"/>
+      </w:tblPr>
+      <w:tblGrid>
+        <w:gridCol w:w="9360"/>
+      </w:tblGrid>
+      <w:tr>
+        <w:tc>
+          <w:tcPr>
+            <w:tcW w:type="dxa" w:w="9360"/>
+            <w:shd w:val="clear" w:color="auto" w:fill="F8FAFC"/>
+            <w:tcMar>
+              <w:top w:w="200" w:type="dxa"/>
+              <w:bottom w:w="200" w:type="dxa"/>
+              <w:left w:w="200" w:type="dxa"/>
+              <w:right w:w="200" w:type="dxa"/>
+            </w:tcMar>
+          </w:tcPr>
+          <w:p>
+            <w:pPr>
+              <w:jc w:val="center"/>
+            </w:pPr>
+            <w:r>
+              <w:rPr>
+                <w:rFonts w:ascii="Arial" w:hAnsi="Arial"/>
+                <w:i/>
+                <w:color w:val="94A3B8"/>
+                <w:sz w:val="20"/>
+              </w:rPr>
+              <w:t>[Captura de pantalla: Historial y Gestión de Reservas por Estado (Verificar archivo local 6_lista_reservas.png)]</w:t>
+            </w:r>
+          </w:p>
+        </w:tc>
+      </w:tr>
+    </w:tbl>
+    <w:p>
+      <w:pPr>
+        <w:spacing w:before="0" w:after="160" w:line="276" w:lineRule="auto"/>
+        <w:jc w:val="both"/>
+      </w:pPr>
+      <w:r>
+        <w:rPr>
+          <w:rFonts w:ascii="Arial" w:hAnsi="Arial"/>
+          <w:sz w:val="22"/>
+        </w:rPr>
+        <w:t>Muestra la lista de reservas registradas para la organización con su estado actual (Pendiente, Completada, Cancelada) y botones de acción rápida para gestionar el recojo.</w:t>
       </w:r>
     </w:p>
     <w:sectPr>

</xml_diff>